<commit_message>
Milestone-1: project updates and fixes
</commit_message>
<xml_diff>
--- a/Milestone-1 Automated docstring Generator.docx
+++ b/Milestone-1 Automated docstring Generator.docx
@@ -2815,8 +2815,481 @@
     <w:p/>
     <w:p/>
     <w:p>
-      <w:r>
+      <w:pPr>
+        <w:rPr>
+          <w:b/>
+          <w:bCs/>
+        </w:rPr>
+      </w:pPr>
+      <w:r>
+        <w:rPr>
+          <w:b/>
+          <w:bCs/>
+        </w:rPr>
         <w:lastRenderedPageBreak/>
+        <w:t xml:space="preserve">Validation Using PEP 257 &amp; </w:t>
+      </w:r>
+      <w:proofErr w:type="spellStart"/>
+      <w:r>
+        <w:rPr>
+          <w:b/>
+          <w:bCs/>
+        </w:rPr>
+        <w:t>pydocstyle</w:t>
+      </w:r>
+      <w:proofErr w:type="spellEnd"/>
+    </w:p>
+    <w:p>
+      <w:r>
+        <w:t xml:space="preserve">As part of Milestone 1 enhancement, </w:t>
+      </w:r>
+      <w:r>
+        <w:rPr>
+          <w:b/>
+          <w:bCs/>
+        </w:rPr>
+        <w:t xml:space="preserve">PEP 257 validation has been fully implemented using the </w:t>
+      </w:r>
+      <w:proofErr w:type="spellStart"/>
+      <w:r>
+        <w:rPr>
+          <w:b/>
+          <w:bCs/>
+        </w:rPr>
+        <w:t>pydocstyle</w:t>
+      </w:r>
+      <w:proofErr w:type="spellEnd"/>
+      <w:r>
+        <w:rPr>
+          <w:b/>
+          <w:bCs/>
+        </w:rPr>
+        <w:t xml:space="preserve"> library</w:t>
+      </w:r>
+      <w:r>
+        <w:t>. This ensures that both existing and generated docstrings comply with standard Python documentation conventions.</w:t>
+      </w:r>
+    </w:p>
+    <w:p>
+      <w:pPr>
+        <w:rPr>
+          <w:b/>
+          <w:bCs/>
+        </w:rPr>
+      </w:pPr>
+      <w:r>
+        <w:rPr>
+          <w:b/>
+          <w:bCs/>
+        </w:rPr>
+        <w:t>8.1 Why PEP 257 Validation?</w:t>
+      </w:r>
+    </w:p>
+    <w:p>
+      <w:pPr>
+        <w:numPr>
+          <w:ilvl w:val="0"/>
+          <w:numId w:val="17"/>
+        </w:numPr>
+      </w:pPr>
+      <w:r>
+        <w:t xml:space="preserve">PEP 257 defines </w:t>
+      </w:r>
+      <w:r>
+        <w:rPr>
+          <w:b/>
+          <w:bCs/>
+        </w:rPr>
+        <w:t>official Python docstring conventions</w:t>
+      </w:r>
+    </w:p>
+    <w:p>
+      <w:pPr>
+        <w:numPr>
+          <w:ilvl w:val="0"/>
+          <w:numId w:val="17"/>
+        </w:numPr>
+      </w:pPr>
+      <w:r>
+        <w:t>Enforces consistency across large codebases</w:t>
+      </w:r>
+    </w:p>
+    <w:p>
+      <w:pPr>
+        <w:numPr>
+          <w:ilvl w:val="0"/>
+          <w:numId w:val="17"/>
+        </w:numPr>
+      </w:pPr>
+      <w:r>
+        <w:t>Detects missing or poorly formatted docstrings early</w:t>
+      </w:r>
+    </w:p>
+    <w:p>
+      <w:pPr>
+        <w:numPr>
+          <w:ilvl w:val="0"/>
+          <w:numId w:val="17"/>
+        </w:numPr>
+      </w:pPr>
+      <w:r>
+        <w:t>Essential for CI/CD and professional-grade tooling</w:t>
+      </w:r>
+    </w:p>
+    <w:p>
+      <w:r>
+        <w:pict w14:anchorId="3F0040DE">
+          <v:rect id="_x0000_i1056" style="width:0;height:1.5pt" o:hralign="center" o:hrstd="t" o:hr="t" fillcolor="#a0a0a0" stroked="f"/>
+        </w:pict>
+      </w:r>
+    </w:p>
+    <w:p>
+      <w:pPr>
+        <w:rPr>
+          <w:b/>
+          <w:bCs/>
+        </w:rPr>
+      </w:pPr>
+      <w:r>
+        <w:rPr>
+          <w:b/>
+          <w:bCs/>
+        </w:rPr>
+        <w:t>8.2 Validation Logic (Backend – parser.py)</w:t>
+      </w:r>
+    </w:p>
+    <w:p>
+      <w:r>
+        <w:t xml:space="preserve">A dedicated function </w:t>
+      </w:r>
+      <w:proofErr w:type="spellStart"/>
+      <w:r>
+        <w:rPr>
+          <w:highlight w:val="yellow"/>
+        </w:rPr>
+        <w:t>validate_with_</w:t>
+      </w:r>
+      <w:proofErr w:type="gramStart"/>
+      <w:r>
+        <w:rPr>
+          <w:highlight w:val="yellow"/>
+        </w:rPr>
+        <w:t>pydocstyle</w:t>
+      </w:r>
+      <w:proofErr w:type="spellEnd"/>
+      <w:r>
+        <w:rPr>
+          <w:highlight w:val="yellow"/>
+        </w:rPr>
+        <w:t>(</w:t>
+      </w:r>
+      <w:proofErr w:type="gramEnd"/>
+      <w:r>
+        <w:rPr>
+          <w:highlight w:val="yellow"/>
+        </w:rPr>
+        <w:t>)</w:t>
+      </w:r>
+      <w:r>
+        <w:t xml:space="preserve"> has been added.</w:t>
+      </w:r>
+    </w:p>
+    <w:p>
+      <w:r>
+        <w:rPr>
+          <w:b/>
+          <w:bCs/>
+        </w:rPr>
+        <w:t>Workflow:</w:t>
+      </w:r>
+    </w:p>
+    <w:p>
+      <w:pPr>
+        <w:numPr>
+          <w:ilvl w:val="0"/>
+          <w:numId w:val="18"/>
+        </w:numPr>
+      </w:pPr>
+      <w:r>
+        <w:t>Accepts a Python file path as input</w:t>
+      </w:r>
+    </w:p>
+    <w:p>
+      <w:pPr>
+        <w:numPr>
+          <w:ilvl w:val="0"/>
+          <w:numId w:val="18"/>
+        </w:numPr>
+      </w:pPr>
+      <w:r>
+        <w:t xml:space="preserve">Runs </w:t>
+      </w:r>
+      <w:proofErr w:type="spellStart"/>
+      <w:proofErr w:type="gramStart"/>
+      <w:r>
+        <w:rPr>
+          <w:highlight w:val="yellow"/>
+        </w:rPr>
+        <w:t>pydocstyle.check</w:t>
+      </w:r>
+      <w:proofErr w:type="spellEnd"/>
+      <w:proofErr w:type="gramEnd"/>
+      <w:r>
+        <w:rPr>
+          <w:highlight w:val="yellow"/>
+        </w:rPr>
+        <w:t>()</w:t>
+      </w:r>
+      <w:r>
+        <w:t xml:space="preserve"> on the file</w:t>
+      </w:r>
+    </w:p>
+    <w:p>
+      <w:pPr>
+        <w:numPr>
+          <w:ilvl w:val="0"/>
+          <w:numId w:val="18"/>
+        </w:numPr>
+      </w:pPr>
+      <w:r>
+        <w:t>Collects all violations with:</w:t>
+      </w:r>
+    </w:p>
+    <w:p>
+      <w:pPr>
+        <w:numPr>
+          <w:ilvl w:val="1"/>
+          <w:numId w:val="18"/>
+        </w:numPr>
+      </w:pPr>
+      <w:r>
+        <w:t>Rule code (e.g., D100, D102)</w:t>
+      </w:r>
+    </w:p>
+    <w:p>
+      <w:pPr>
+        <w:numPr>
+          <w:ilvl w:val="1"/>
+          <w:numId w:val="18"/>
+        </w:numPr>
+      </w:pPr>
+      <w:r>
+        <w:t>Error message</w:t>
+      </w:r>
+    </w:p>
+    <w:p>
+      <w:pPr>
+        <w:numPr>
+          <w:ilvl w:val="1"/>
+          <w:numId w:val="18"/>
+        </w:numPr>
+      </w:pPr>
+      <w:r>
+        <w:t>Line number</w:t>
+      </w:r>
+    </w:p>
+    <w:p>
+      <w:pPr>
+        <w:numPr>
+          <w:ilvl w:val="1"/>
+          <w:numId w:val="18"/>
+        </w:numPr>
+      </w:pPr>
+      <w:r>
+        <w:t>Affected object (class / function)</w:t>
+      </w:r>
+    </w:p>
+    <w:p>
+      <w:pPr>
+        <w:numPr>
+          <w:ilvl w:val="0"/>
+          <w:numId w:val="18"/>
+        </w:numPr>
+      </w:pPr>
+      <w:r>
+        <w:t>Returns a structured validation report</w:t>
+      </w:r>
+    </w:p>
+    <w:p>
+      <w:pPr>
+        <w:rPr>
+          <w:b/>
+          <w:bCs/>
+        </w:rPr>
+      </w:pPr>
+      <w:r>
+        <w:rPr>
+          <w:b/>
+          <w:bCs/>
+        </w:rPr>
+        <w:t>Returned Structure:</w:t>
+      </w:r>
+    </w:p>
+    <w:p>
+      <w:r>
+        <w:drawing>
+          <wp:inline distT="0" distB="0" distL="0" distR="0" wp14:anchorId="5029E5B4" wp14:editId="173E6C93">
+            <wp:extent cx="5731510" cy="2015490"/>
+            <wp:effectExtent l="0" t="0" r="2540" b="3810"/>
+            <wp:docPr id="1104029060" name="Picture 1"/>
+            <wp:cNvGraphicFramePr>
+              <a:graphicFrameLocks xmlns:a="http://schemas.openxmlformats.org/drawingml/2006/main" noChangeAspect="1"/>
+            </wp:cNvGraphicFramePr>
+            <a:graphic xmlns:a="http://schemas.openxmlformats.org/drawingml/2006/main">
+              <a:graphicData uri="http://schemas.openxmlformats.org/drawingml/2006/picture">
+                <pic:pic xmlns:pic="http://schemas.openxmlformats.org/drawingml/2006/picture">
+                  <pic:nvPicPr>
+                    <pic:cNvPr id="1104029060" name=""/>
+                    <pic:cNvPicPr/>
+                  </pic:nvPicPr>
+                  <pic:blipFill>
+                    <a:blip r:embed="rId5"/>
+                    <a:stretch>
+                      <a:fillRect/>
+                    </a:stretch>
+                  </pic:blipFill>
+                  <pic:spPr>
+                    <a:xfrm>
+                      <a:off x="0" y="0"/>
+                      <a:ext cx="5731510" cy="2015490"/>
+                    </a:xfrm>
+                    <a:prstGeom prst="rect">
+                      <a:avLst/>
+                    </a:prstGeom>
+                  </pic:spPr>
+                </pic:pic>
+              </a:graphicData>
+            </a:graphic>
+          </wp:inline>
+        </w:drawing>
+      </w:r>
+    </w:p>
+    <w:p/>
+    <w:p/>
+    <w:p>
+      <w:r>
+        <w:lastRenderedPageBreak/>
+        <w:pict w14:anchorId="07C54FBB">
+          <v:rect id="_x0000_i1057" style="width:0;height:1.5pt" o:hralign="center" o:hrstd="t" o:hr="t" fillcolor="#a0a0a0" stroked="f"/>
+        </w:pict>
+      </w:r>
+    </w:p>
+    <w:p>
+      <w:pPr>
+        <w:rPr>
+          <w:b/>
+          <w:bCs/>
+        </w:rPr>
+      </w:pPr>
+      <w:r>
+        <w:rPr>
+          <w:b/>
+          <w:bCs/>
+        </w:rPr>
+        <w:t>8.3 UI Integration (</w:t>
+      </w:r>
+      <w:proofErr w:type="spellStart"/>
+      <w:r>
+        <w:rPr>
+          <w:b/>
+          <w:bCs/>
+        </w:rPr>
+        <w:t>Streamlit</w:t>
+      </w:r>
+      <w:proofErr w:type="spellEnd"/>
+      <w:r>
+        <w:rPr>
+          <w:b/>
+          <w:bCs/>
+        </w:rPr>
+        <w:t xml:space="preserve"> – app.py)</w:t>
+      </w:r>
+    </w:p>
+    <w:p>
+      <w:r>
+        <w:t xml:space="preserve">The </w:t>
+      </w:r>
+      <w:proofErr w:type="spellStart"/>
+      <w:r>
+        <w:t>Streamlit</w:t>
+      </w:r>
+      <w:proofErr w:type="spellEnd"/>
+      <w:r>
+        <w:t xml:space="preserve"> interface now includes a </w:t>
+      </w:r>
+      <w:r>
+        <w:rPr>
+          <w:b/>
+          <w:bCs/>
+        </w:rPr>
+        <w:t>PEP 257 Validation Section</w:t>
+      </w:r>
+      <w:r>
+        <w:t>:</w:t>
+      </w:r>
+    </w:p>
+    <w:p>
+      <w:pPr>
+        <w:numPr>
+          <w:ilvl w:val="0"/>
+          <w:numId w:val="19"/>
+        </w:numPr>
+      </w:pPr>
+      <w:r>
+        <w:t>Displays total number of violations</w:t>
+      </w:r>
+    </w:p>
+    <w:p>
+      <w:pPr>
+        <w:numPr>
+          <w:ilvl w:val="0"/>
+          <w:numId w:val="19"/>
+        </w:numPr>
+      </w:pPr>
+      <w:r>
+        <w:t>Shows overall validation status (PASS / FAIL)</w:t>
+      </w:r>
+    </w:p>
+    <w:p>
+      <w:pPr>
+        <w:numPr>
+          <w:ilvl w:val="0"/>
+          <w:numId w:val="19"/>
+        </w:numPr>
+      </w:pPr>
+      <w:r>
+        <w:t>Lists all violations with rule codes and descriptions</w:t>
+      </w:r>
+    </w:p>
+    <w:p>
+      <w:pPr>
+        <w:numPr>
+          <w:ilvl w:val="0"/>
+          <w:numId w:val="19"/>
+        </w:numPr>
+      </w:pPr>
+      <w:r>
+        <w:t>Provides immediate visual feedback to the user</w:t>
+      </w:r>
+    </w:p>
+    <w:p>
+      <w:r>
+        <w:t xml:space="preserve">This makes the tool </w:t>
+      </w:r>
+      <w:r>
+        <w:rPr>
+          <w:b/>
+          <w:bCs/>
+        </w:rPr>
+        <w:t>interactive and reviewer-friendly</w:t>
+      </w:r>
+      <w:r>
+        <w:t>, allowing developers to inspect documentation quality instantly.</w:t>
+      </w:r>
+    </w:p>
+    <w:p/>
+    <w:p>
+      <w:r>
         <w:pict w14:anchorId="7669C00F">
           <v:rect id="_x0000_i1039" style="width:0;height:1.5pt" o:hralign="center" o:hrstd="t" o:hr="t" fillcolor="#a0a0a0" stroked="f"/>
         </w:pict>
@@ -2860,7 +3333,7 @@
                     <pic:cNvPicPr/>
                   </pic:nvPicPr>
                   <pic:blipFill>
-                    <a:blip r:embed="rId5"/>
+                    <a:blip r:embed="rId6"/>
                     <a:stretch>
                       <a:fillRect/>
                     </a:stretch>
@@ -2917,7 +3390,7 @@
                     <pic:cNvPicPr/>
                   </pic:nvPicPr>
                   <pic:blipFill>
-                    <a:blip r:embed="rId6"/>
+                    <a:blip r:embed="rId7"/>
                     <a:stretch>
                       <a:fillRect/>
                     </a:stretch>
@@ -2970,6 +3443,7 @@
           <w:iCs/>
           <w:noProof/>
         </w:rPr>
+        <w:lastRenderedPageBreak/>
         <w:drawing>
           <wp:inline distT="0" distB="0" distL="0" distR="0" wp14:anchorId="3F6B31AD" wp14:editId="5761DFB8">
             <wp:extent cx="5731510" cy="2643956"/>
@@ -2986,7 +3460,7 @@
                     <pic:cNvPicPr/>
                   </pic:nvPicPr>
                   <pic:blipFill rotWithShape="1">
-                    <a:blip r:embed="rId7"/>
+                    <a:blip r:embed="rId8"/>
                     <a:srcRect r="19034"/>
                     <a:stretch>
                       <a:fillRect/>
@@ -3026,7 +3500,6 @@
         <w:jc w:val="center"/>
       </w:pPr>
       <w:r>
-        <w:lastRenderedPageBreak/>
         <w:pict w14:anchorId="7D4A8D00">
           <v:rect id="_x0000_i1041" style="width:0;height:1.5pt" o:hralign="center" o:hrstd="t" o:hr="t" fillcolor="#a0a0a0" stroked="f"/>
         </w:pict>
@@ -3070,7 +3543,7 @@
                     <pic:cNvPicPr/>
                   </pic:nvPicPr>
                   <pic:blipFill>
-                    <a:blip r:embed="rId8"/>
+                    <a:blip r:embed="rId9"/>
                     <a:stretch>
                       <a:fillRect/>
                     </a:stretch>
@@ -3090,6 +3563,11 @@
           </wp:inline>
         </w:drawing>
       </w:r>
+    </w:p>
+    <w:p/>
+    <w:p/>
+    <w:p/>
+    <w:p>
       <w:r>
         <w:pict w14:anchorId="301030BD">
           <v:rect id="_x0000_i1042" style="width:0;height:1.5pt" o:hralign="center" o:hrstd="t" o:hr="t" fillcolor="#a0a0a0" stroked="f"/>
@@ -3163,6 +3641,7 @@
         </w:numPr>
       </w:pPr>
       <w:r>
+        <w:lastRenderedPageBreak/>
         <w:t xml:space="preserve">Visualizes results via </w:t>
       </w:r>
       <w:proofErr w:type="spellStart"/>
@@ -3850,6 +4329,155 @@
     </w:lvl>
   </w:abstractNum>
   <w:abstractNum w:abstractNumId="4" w15:restartNumberingAfterBreak="0">
+    <w:nsid w:val="312A5D92"/>
+    <w:multiLevelType w:val="multilevel"/>
+    <w:tmpl w:val="C81207B8"/>
+    <w:lvl w:ilvl="0">
+      <w:start w:val="1"/>
+      <w:numFmt w:val="bullet"/>
+      <w:lvlText w:val=""/>
+      <w:lvlJc w:val="left"/>
+      <w:pPr>
+        <w:tabs>
+          <w:tab w:val="num" w:pos="720"/>
+        </w:tabs>
+        <w:ind w:left="720" w:hanging="360"/>
+      </w:pPr>
+      <w:rPr>
+        <w:rFonts w:ascii="Symbol" w:hAnsi="Symbol" w:hint="default"/>
+        <w:sz w:val="20"/>
+      </w:rPr>
+    </w:lvl>
+    <w:lvl w:ilvl="1" w:tentative="1">
+      <w:start w:val="1"/>
+      <w:numFmt w:val="bullet"/>
+      <w:lvlText w:val="o"/>
+      <w:lvlJc w:val="left"/>
+      <w:pPr>
+        <w:tabs>
+          <w:tab w:val="num" w:pos="1440"/>
+        </w:tabs>
+        <w:ind w:left="1440" w:hanging="360"/>
+      </w:pPr>
+      <w:rPr>
+        <w:rFonts w:ascii="Courier New" w:hAnsi="Courier New" w:hint="default"/>
+        <w:sz w:val="20"/>
+      </w:rPr>
+    </w:lvl>
+    <w:lvl w:ilvl="2" w:tentative="1">
+      <w:start w:val="1"/>
+      <w:numFmt w:val="bullet"/>
+      <w:lvlText w:val=""/>
+      <w:lvlJc w:val="left"/>
+      <w:pPr>
+        <w:tabs>
+          <w:tab w:val="num" w:pos="2160"/>
+        </w:tabs>
+        <w:ind w:left="2160" w:hanging="360"/>
+      </w:pPr>
+      <w:rPr>
+        <w:rFonts w:ascii="Wingdings" w:hAnsi="Wingdings" w:hint="default"/>
+        <w:sz w:val="20"/>
+      </w:rPr>
+    </w:lvl>
+    <w:lvl w:ilvl="3" w:tentative="1">
+      <w:start w:val="1"/>
+      <w:numFmt w:val="bullet"/>
+      <w:lvlText w:val=""/>
+      <w:lvlJc w:val="left"/>
+      <w:pPr>
+        <w:tabs>
+          <w:tab w:val="num" w:pos="2880"/>
+        </w:tabs>
+        <w:ind w:left="2880" w:hanging="360"/>
+      </w:pPr>
+      <w:rPr>
+        <w:rFonts w:ascii="Wingdings" w:hAnsi="Wingdings" w:hint="default"/>
+        <w:sz w:val="20"/>
+      </w:rPr>
+    </w:lvl>
+    <w:lvl w:ilvl="4" w:tentative="1">
+      <w:start w:val="1"/>
+      <w:numFmt w:val="bullet"/>
+      <w:lvlText w:val=""/>
+      <w:lvlJc w:val="left"/>
+      <w:pPr>
+        <w:tabs>
+          <w:tab w:val="num" w:pos="3600"/>
+        </w:tabs>
+        <w:ind w:left="3600" w:hanging="360"/>
+      </w:pPr>
+      <w:rPr>
+        <w:rFonts w:ascii="Wingdings" w:hAnsi="Wingdings" w:hint="default"/>
+        <w:sz w:val="20"/>
+      </w:rPr>
+    </w:lvl>
+    <w:lvl w:ilvl="5" w:tentative="1">
+      <w:start w:val="1"/>
+      <w:numFmt w:val="bullet"/>
+      <w:lvlText w:val=""/>
+      <w:lvlJc w:val="left"/>
+      <w:pPr>
+        <w:tabs>
+          <w:tab w:val="num" w:pos="4320"/>
+        </w:tabs>
+        <w:ind w:left="4320" w:hanging="360"/>
+      </w:pPr>
+      <w:rPr>
+        <w:rFonts w:ascii="Wingdings" w:hAnsi="Wingdings" w:hint="default"/>
+        <w:sz w:val="20"/>
+      </w:rPr>
+    </w:lvl>
+    <w:lvl w:ilvl="6" w:tentative="1">
+      <w:start w:val="1"/>
+      <w:numFmt w:val="bullet"/>
+      <w:lvlText w:val=""/>
+      <w:lvlJc w:val="left"/>
+      <w:pPr>
+        <w:tabs>
+          <w:tab w:val="num" w:pos="5040"/>
+        </w:tabs>
+        <w:ind w:left="5040" w:hanging="360"/>
+      </w:pPr>
+      <w:rPr>
+        <w:rFonts w:ascii="Wingdings" w:hAnsi="Wingdings" w:hint="default"/>
+        <w:sz w:val="20"/>
+      </w:rPr>
+    </w:lvl>
+    <w:lvl w:ilvl="7" w:tentative="1">
+      <w:start w:val="1"/>
+      <w:numFmt w:val="bullet"/>
+      <w:lvlText w:val=""/>
+      <w:lvlJc w:val="left"/>
+      <w:pPr>
+        <w:tabs>
+          <w:tab w:val="num" w:pos="5760"/>
+        </w:tabs>
+        <w:ind w:left="5760" w:hanging="360"/>
+      </w:pPr>
+      <w:rPr>
+        <w:rFonts w:ascii="Wingdings" w:hAnsi="Wingdings" w:hint="default"/>
+        <w:sz w:val="20"/>
+      </w:rPr>
+    </w:lvl>
+    <w:lvl w:ilvl="8" w:tentative="1">
+      <w:start w:val="1"/>
+      <w:numFmt w:val="bullet"/>
+      <w:lvlText w:val=""/>
+      <w:lvlJc w:val="left"/>
+      <w:pPr>
+        <w:tabs>
+          <w:tab w:val="num" w:pos="6480"/>
+        </w:tabs>
+        <w:ind w:left="6480" w:hanging="360"/>
+      </w:pPr>
+      <w:rPr>
+        <w:rFonts w:ascii="Wingdings" w:hAnsi="Wingdings" w:hint="default"/>
+        <w:sz w:val="20"/>
+      </w:rPr>
+    </w:lvl>
+  </w:abstractNum>
+  <w:abstractNum w:abstractNumId="5" w15:restartNumberingAfterBreak="0">
     <w:nsid w:val="3A662BCA"/>
     <w:multiLevelType w:val="multilevel"/>
     <w:tmpl w:val="4C0606CE"/>
@@ -3998,7 +4626,7 @@
       </w:rPr>
     </w:lvl>
   </w:abstractNum>
-  <w:abstractNum w:abstractNumId="5" w15:restartNumberingAfterBreak="0">
+  <w:abstractNum w:abstractNumId="6" w15:restartNumberingAfterBreak="0">
     <w:nsid w:val="3D342AE3"/>
     <w:multiLevelType w:val="multilevel"/>
     <w:tmpl w:val="FB28DCD2"/>
@@ -4147,7 +4775,156 @@
       </w:rPr>
     </w:lvl>
   </w:abstractNum>
-  <w:abstractNum w:abstractNumId="6" w15:restartNumberingAfterBreak="0">
+  <w:abstractNum w:abstractNumId="7" w15:restartNumberingAfterBreak="0">
+    <w:nsid w:val="3F485C67"/>
+    <w:multiLevelType w:val="multilevel"/>
+    <w:tmpl w:val="6B34233E"/>
+    <w:lvl w:ilvl="0">
+      <w:start w:val="1"/>
+      <w:numFmt w:val="bullet"/>
+      <w:lvlText w:val=""/>
+      <w:lvlJc w:val="left"/>
+      <w:pPr>
+        <w:tabs>
+          <w:tab w:val="num" w:pos="720"/>
+        </w:tabs>
+        <w:ind w:left="720" w:hanging="360"/>
+      </w:pPr>
+      <w:rPr>
+        <w:rFonts w:ascii="Symbol" w:hAnsi="Symbol" w:hint="default"/>
+        <w:sz w:val="20"/>
+      </w:rPr>
+    </w:lvl>
+    <w:lvl w:ilvl="1" w:tentative="1">
+      <w:start w:val="1"/>
+      <w:numFmt w:val="bullet"/>
+      <w:lvlText w:val="o"/>
+      <w:lvlJc w:val="left"/>
+      <w:pPr>
+        <w:tabs>
+          <w:tab w:val="num" w:pos="1440"/>
+        </w:tabs>
+        <w:ind w:left="1440" w:hanging="360"/>
+      </w:pPr>
+      <w:rPr>
+        <w:rFonts w:ascii="Courier New" w:hAnsi="Courier New" w:hint="default"/>
+        <w:sz w:val="20"/>
+      </w:rPr>
+    </w:lvl>
+    <w:lvl w:ilvl="2" w:tentative="1">
+      <w:start w:val="1"/>
+      <w:numFmt w:val="bullet"/>
+      <w:lvlText w:val=""/>
+      <w:lvlJc w:val="left"/>
+      <w:pPr>
+        <w:tabs>
+          <w:tab w:val="num" w:pos="2160"/>
+        </w:tabs>
+        <w:ind w:left="2160" w:hanging="360"/>
+      </w:pPr>
+      <w:rPr>
+        <w:rFonts w:ascii="Wingdings" w:hAnsi="Wingdings" w:hint="default"/>
+        <w:sz w:val="20"/>
+      </w:rPr>
+    </w:lvl>
+    <w:lvl w:ilvl="3" w:tentative="1">
+      <w:start w:val="1"/>
+      <w:numFmt w:val="bullet"/>
+      <w:lvlText w:val=""/>
+      <w:lvlJc w:val="left"/>
+      <w:pPr>
+        <w:tabs>
+          <w:tab w:val="num" w:pos="2880"/>
+        </w:tabs>
+        <w:ind w:left="2880" w:hanging="360"/>
+      </w:pPr>
+      <w:rPr>
+        <w:rFonts w:ascii="Wingdings" w:hAnsi="Wingdings" w:hint="default"/>
+        <w:sz w:val="20"/>
+      </w:rPr>
+    </w:lvl>
+    <w:lvl w:ilvl="4" w:tentative="1">
+      <w:start w:val="1"/>
+      <w:numFmt w:val="bullet"/>
+      <w:lvlText w:val=""/>
+      <w:lvlJc w:val="left"/>
+      <w:pPr>
+        <w:tabs>
+          <w:tab w:val="num" w:pos="3600"/>
+        </w:tabs>
+        <w:ind w:left="3600" w:hanging="360"/>
+      </w:pPr>
+      <w:rPr>
+        <w:rFonts w:ascii="Wingdings" w:hAnsi="Wingdings" w:hint="default"/>
+        <w:sz w:val="20"/>
+      </w:rPr>
+    </w:lvl>
+    <w:lvl w:ilvl="5" w:tentative="1">
+      <w:start w:val="1"/>
+      <w:numFmt w:val="bullet"/>
+      <w:lvlText w:val=""/>
+      <w:lvlJc w:val="left"/>
+      <w:pPr>
+        <w:tabs>
+          <w:tab w:val="num" w:pos="4320"/>
+        </w:tabs>
+        <w:ind w:left="4320" w:hanging="360"/>
+      </w:pPr>
+      <w:rPr>
+        <w:rFonts w:ascii="Wingdings" w:hAnsi="Wingdings" w:hint="default"/>
+        <w:sz w:val="20"/>
+      </w:rPr>
+    </w:lvl>
+    <w:lvl w:ilvl="6" w:tentative="1">
+      <w:start w:val="1"/>
+      <w:numFmt w:val="bullet"/>
+      <w:lvlText w:val=""/>
+      <w:lvlJc w:val="left"/>
+      <w:pPr>
+        <w:tabs>
+          <w:tab w:val="num" w:pos="5040"/>
+        </w:tabs>
+        <w:ind w:left="5040" w:hanging="360"/>
+      </w:pPr>
+      <w:rPr>
+        <w:rFonts w:ascii="Wingdings" w:hAnsi="Wingdings" w:hint="default"/>
+        <w:sz w:val="20"/>
+      </w:rPr>
+    </w:lvl>
+    <w:lvl w:ilvl="7" w:tentative="1">
+      <w:start w:val="1"/>
+      <w:numFmt w:val="bullet"/>
+      <w:lvlText w:val=""/>
+      <w:lvlJc w:val="left"/>
+      <w:pPr>
+        <w:tabs>
+          <w:tab w:val="num" w:pos="5760"/>
+        </w:tabs>
+        <w:ind w:left="5760" w:hanging="360"/>
+      </w:pPr>
+      <w:rPr>
+        <w:rFonts w:ascii="Wingdings" w:hAnsi="Wingdings" w:hint="default"/>
+        <w:sz w:val="20"/>
+      </w:rPr>
+    </w:lvl>
+    <w:lvl w:ilvl="8" w:tentative="1">
+      <w:start w:val="1"/>
+      <w:numFmt w:val="bullet"/>
+      <w:lvlText w:val=""/>
+      <w:lvlJc w:val="left"/>
+      <w:pPr>
+        <w:tabs>
+          <w:tab w:val="num" w:pos="6480"/>
+        </w:tabs>
+        <w:ind w:left="6480" w:hanging="360"/>
+      </w:pPr>
+      <w:rPr>
+        <w:rFonts w:ascii="Wingdings" w:hAnsi="Wingdings" w:hint="default"/>
+        <w:sz w:val="20"/>
+      </w:rPr>
+    </w:lvl>
+  </w:abstractNum>
+  <w:abstractNum w:abstractNumId="8" w15:restartNumberingAfterBreak="0">
     <w:nsid w:val="42C24E17"/>
     <w:multiLevelType w:val="multilevel"/>
     <w:tmpl w:val="28E67934"/>
@@ -4296,7 +5073,7 @@
       </w:rPr>
     </w:lvl>
   </w:abstractNum>
-  <w:abstractNum w:abstractNumId="7" w15:restartNumberingAfterBreak="0">
+  <w:abstractNum w:abstractNumId="9" w15:restartNumberingAfterBreak="0">
     <w:nsid w:val="48BF0479"/>
     <w:multiLevelType w:val="multilevel"/>
     <w:tmpl w:val="A74234EE"/>
@@ -4445,7 +5222,7 @@
       </w:rPr>
     </w:lvl>
   </w:abstractNum>
-  <w:abstractNum w:abstractNumId="8" w15:restartNumberingAfterBreak="0">
+  <w:abstractNum w:abstractNumId="10" w15:restartNumberingAfterBreak="0">
     <w:nsid w:val="4EE024AD"/>
     <w:multiLevelType w:val="multilevel"/>
     <w:tmpl w:val="50E4C8DE"/>
@@ -4594,7 +5371,7 @@
       </w:rPr>
     </w:lvl>
   </w:abstractNum>
-  <w:abstractNum w:abstractNumId="9" w15:restartNumberingAfterBreak="0">
+  <w:abstractNum w:abstractNumId="11" w15:restartNumberingAfterBreak="0">
     <w:nsid w:val="5078547A"/>
     <w:multiLevelType w:val="multilevel"/>
     <w:tmpl w:val="22B86F54"/>
@@ -4743,7 +5520,7 @@
       </w:rPr>
     </w:lvl>
   </w:abstractNum>
-  <w:abstractNum w:abstractNumId="10" w15:restartNumberingAfterBreak="0">
+  <w:abstractNum w:abstractNumId="12" w15:restartNumberingAfterBreak="0">
     <w:nsid w:val="52FF4B3F"/>
     <w:multiLevelType w:val="multilevel"/>
     <w:tmpl w:val="F9223772"/>
@@ -4892,7 +5669,7 @@
       </w:rPr>
     </w:lvl>
   </w:abstractNum>
-  <w:abstractNum w:abstractNumId="11" w15:restartNumberingAfterBreak="0">
+  <w:abstractNum w:abstractNumId="13" w15:restartNumberingAfterBreak="0">
     <w:nsid w:val="6018484E"/>
     <w:multiLevelType w:val="multilevel"/>
     <w:tmpl w:val="26E0BC96"/>
@@ -5041,7 +5818,7 @@
       </w:rPr>
     </w:lvl>
   </w:abstractNum>
-  <w:abstractNum w:abstractNumId="12" w15:restartNumberingAfterBreak="0">
+  <w:abstractNum w:abstractNumId="14" w15:restartNumberingAfterBreak="0">
     <w:nsid w:val="61B774CC"/>
     <w:multiLevelType w:val="multilevel"/>
     <w:tmpl w:val="1AE8894E"/>
@@ -5190,7 +5967,124 @@
       </w:rPr>
     </w:lvl>
   </w:abstractNum>
-  <w:abstractNum w:abstractNumId="13" w15:restartNumberingAfterBreak="0">
+  <w:abstractNum w:abstractNumId="15" w15:restartNumberingAfterBreak="0">
+    <w:nsid w:val="694D6CAA"/>
+    <w:multiLevelType w:val="multilevel"/>
+    <w:tmpl w:val="ED8CDBF6"/>
+    <w:lvl w:ilvl="0">
+      <w:start w:val="1"/>
+      <w:numFmt w:val="decimal"/>
+      <w:lvlText w:val="%1."/>
+      <w:lvlJc w:val="left"/>
+      <w:pPr>
+        <w:tabs>
+          <w:tab w:val="num" w:pos="720"/>
+        </w:tabs>
+        <w:ind w:left="720" w:hanging="360"/>
+      </w:pPr>
+    </w:lvl>
+    <w:lvl w:ilvl="1">
+      <w:start w:val="1"/>
+      <w:numFmt w:val="bullet"/>
+      <w:lvlText w:val="o"/>
+      <w:lvlJc w:val="left"/>
+      <w:pPr>
+        <w:tabs>
+          <w:tab w:val="num" w:pos="1440"/>
+        </w:tabs>
+        <w:ind w:left="1440" w:hanging="360"/>
+      </w:pPr>
+      <w:rPr>
+        <w:rFonts w:ascii="Courier New" w:hAnsi="Courier New" w:hint="default"/>
+        <w:sz w:val="20"/>
+      </w:rPr>
+    </w:lvl>
+    <w:lvl w:ilvl="2" w:tentative="1">
+      <w:start w:val="1"/>
+      <w:numFmt w:val="decimal"/>
+      <w:lvlText w:val="%3."/>
+      <w:lvlJc w:val="left"/>
+      <w:pPr>
+        <w:tabs>
+          <w:tab w:val="num" w:pos="2160"/>
+        </w:tabs>
+        <w:ind w:left="2160" w:hanging="360"/>
+      </w:pPr>
+    </w:lvl>
+    <w:lvl w:ilvl="3" w:tentative="1">
+      <w:start w:val="1"/>
+      <w:numFmt w:val="decimal"/>
+      <w:lvlText w:val="%4."/>
+      <w:lvlJc w:val="left"/>
+      <w:pPr>
+        <w:tabs>
+          <w:tab w:val="num" w:pos="2880"/>
+        </w:tabs>
+        <w:ind w:left="2880" w:hanging="360"/>
+      </w:pPr>
+    </w:lvl>
+    <w:lvl w:ilvl="4" w:tentative="1">
+      <w:start w:val="1"/>
+      <w:numFmt w:val="decimal"/>
+      <w:lvlText w:val="%5."/>
+      <w:lvlJc w:val="left"/>
+      <w:pPr>
+        <w:tabs>
+          <w:tab w:val="num" w:pos="3600"/>
+        </w:tabs>
+        <w:ind w:left="3600" w:hanging="360"/>
+      </w:pPr>
+    </w:lvl>
+    <w:lvl w:ilvl="5" w:tentative="1">
+      <w:start w:val="1"/>
+      <w:numFmt w:val="decimal"/>
+      <w:lvlText w:val="%6."/>
+      <w:lvlJc w:val="left"/>
+      <w:pPr>
+        <w:tabs>
+          <w:tab w:val="num" w:pos="4320"/>
+        </w:tabs>
+        <w:ind w:left="4320" w:hanging="360"/>
+      </w:pPr>
+    </w:lvl>
+    <w:lvl w:ilvl="6" w:tentative="1">
+      <w:start w:val="1"/>
+      <w:numFmt w:val="decimal"/>
+      <w:lvlText w:val="%7."/>
+      <w:lvlJc w:val="left"/>
+      <w:pPr>
+        <w:tabs>
+          <w:tab w:val="num" w:pos="5040"/>
+        </w:tabs>
+        <w:ind w:left="5040" w:hanging="360"/>
+      </w:pPr>
+    </w:lvl>
+    <w:lvl w:ilvl="7" w:tentative="1">
+      <w:start w:val="1"/>
+      <w:numFmt w:val="decimal"/>
+      <w:lvlText w:val="%8."/>
+      <w:lvlJc w:val="left"/>
+      <w:pPr>
+        <w:tabs>
+          <w:tab w:val="num" w:pos="5760"/>
+        </w:tabs>
+        <w:ind w:left="5760" w:hanging="360"/>
+      </w:pPr>
+    </w:lvl>
+    <w:lvl w:ilvl="8" w:tentative="1">
+      <w:start w:val="1"/>
+      <w:numFmt w:val="decimal"/>
+      <w:lvlText w:val="%9."/>
+      <w:lvlJc w:val="left"/>
+      <w:pPr>
+        <w:tabs>
+          <w:tab w:val="num" w:pos="6480"/>
+        </w:tabs>
+        <w:ind w:left="6480" w:hanging="360"/>
+      </w:pPr>
+    </w:lvl>
+  </w:abstractNum>
+  <w:abstractNum w:abstractNumId="16" w15:restartNumberingAfterBreak="0">
     <w:nsid w:val="6CD865D8"/>
     <w:multiLevelType w:val="multilevel"/>
     <w:tmpl w:val="AFAA7F30"/>
@@ -5339,7 +6233,7 @@
       </w:rPr>
     </w:lvl>
   </w:abstractNum>
-  <w:abstractNum w:abstractNumId="14" w15:restartNumberingAfterBreak="0">
+  <w:abstractNum w:abstractNumId="17" w15:restartNumberingAfterBreak="0">
     <w:nsid w:val="6EAB5902"/>
     <w:multiLevelType w:val="multilevel"/>
     <w:tmpl w:val="B32887B8"/>
@@ -5488,7 +6382,7 @@
       </w:rPr>
     </w:lvl>
   </w:abstractNum>
-  <w:abstractNum w:abstractNumId="15" w15:restartNumberingAfterBreak="0">
+  <w:abstractNum w:abstractNumId="18" w15:restartNumberingAfterBreak="0">
     <w:nsid w:val="7A86467E"/>
     <w:multiLevelType w:val="multilevel"/>
     <w:tmpl w:val="0B7E3050"/>
@@ -5641,49 +6535,58 @@
     <w:abstractNumId w:val="3"/>
   </w:num>
   <w:num w:numId="2" w16cid:durableId="1793816298">
-    <w:abstractNumId w:val="7"/>
+    <w:abstractNumId w:val="9"/>
   </w:num>
   <w:num w:numId="3" w16cid:durableId="588348767">
-    <w:abstractNumId w:val="4"/>
+    <w:abstractNumId w:val="5"/>
   </w:num>
   <w:num w:numId="4" w16cid:durableId="1619095946">
-    <w:abstractNumId w:val="13"/>
+    <w:abstractNumId w:val="16"/>
   </w:num>
   <w:num w:numId="5" w16cid:durableId="1962689919">
     <w:abstractNumId w:val="0"/>
   </w:num>
   <w:num w:numId="6" w16cid:durableId="697002147">
-    <w:abstractNumId w:val="9"/>
+    <w:abstractNumId w:val="11"/>
   </w:num>
   <w:num w:numId="7" w16cid:durableId="1999916836">
-    <w:abstractNumId w:val="15"/>
+    <w:abstractNumId w:val="18"/>
   </w:num>
   <w:num w:numId="8" w16cid:durableId="1248877929">
-    <w:abstractNumId w:val="8"/>
+    <w:abstractNumId w:val="10"/>
   </w:num>
   <w:num w:numId="9" w16cid:durableId="78868494">
-    <w:abstractNumId w:val="12"/>
+    <w:abstractNumId w:val="14"/>
   </w:num>
   <w:num w:numId="10" w16cid:durableId="123699009">
     <w:abstractNumId w:val="2"/>
   </w:num>
   <w:num w:numId="11" w16cid:durableId="1913731602">
-    <w:abstractNumId w:val="5"/>
+    <w:abstractNumId w:val="6"/>
   </w:num>
   <w:num w:numId="12" w16cid:durableId="1891844849">
     <w:abstractNumId w:val="1"/>
   </w:num>
   <w:num w:numId="13" w16cid:durableId="902371795">
-    <w:abstractNumId w:val="10"/>
+    <w:abstractNumId w:val="12"/>
   </w:num>
   <w:num w:numId="14" w16cid:durableId="40903734">
-    <w:abstractNumId w:val="14"/>
+    <w:abstractNumId w:val="17"/>
   </w:num>
   <w:num w:numId="15" w16cid:durableId="496848001">
-    <w:abstractNumId w:val="11"/>
+    <w:abstractNumId w:val="13"/>
   </w:num>
   <w:num w:numId="16" w16cid:durableId="782960516">
-    <w:abstractNumId w:val="6"/>
+    <w:abstractNumId w:val="8"/>
+  </w:num>
+  <w:num w:numId="17" w16cid:durableId="1089808492">
+    <w:abstractNumId w:val="4"/>
+  </w:num>
+  <w:num w:numId="18" w16cid:durableId="264575318">
+    <w:abstractNumId w:val="15"/>
+  </w:num>
+  <w:num w:numId="19" w16cid:durableId="909777982">
+    <w:abstractNumId w:val="7"/>
   </w:num>
 </w:numbering>
 </file>

</xml_diff>